<commit_message>
Mirror research workspace architecture stage 1
</commit_message>
<xml_diff>
--- a/docs/VerseVAD_User_Manual.docx
+++ b/docs/VerseVAD_User_Manual.docx
@@ -71,7 +71,7 @@
           <w:color w:val="66727C"/>
           <w:sz w:val="21"/>
         </w:rPr>
-        <w:t xml:space="preserve"> July 28, 2026</w:t>
+        <w:t xml:space="preserve"> July 29, 2026</w:t>
       </w:r>
       <w:r>
         <w:rPr>
@@ -2436,7 +2436,7 @@
           <w:rFonts w:ascii="Calibri" w:hAnsi="Calibri"/>
           <w:sz w:val="22"/>
         </w:rPr>
-        <w:t>The shared application header contains:</w:t>
+        <w:t>The shared application header groups workspaces under:</w:t>
       </w:r>
     </w:p>
     <w:p>
@@ -2455,7 +2455,14 @@
           <w:b/>
           <w:sz w:val="22"/>
         </w:rPr>
-        <w:t>Single Poem</w:t>
+        <w:t>Analyze</w:t>
+      </w:r>
+      <w:r>
+        <w:rPr>
+          <w:rFonts w:ascii="Calibri" w:hAnsi="Calibri"/>
+          <w:sz w:val="22"/>
+        </w:rPr>
+        <w:t>: Single Poem, Compare Poems, Other Text, and Lexicon Explorer;</w:t>
       </w:r>
     </w:p>
     <w:p>
@@ -2474,7 +2481,14 @@
           <w:b/>
           <w:sz w:val="22"/>
         </w:rPr>
-        <w:t>Project / Corpus</w:t>
+        <w:t>Collections</w:t>
+      </w:r>
+      <w:r>
+        <w:rPr>
+          <w:rFonts w:ascii="Calibri" w:hAnsi="Calibri"/>
+          <w:sz w:val="22"/>
+        </w:rPr>
+        <w:t>: Saved Projects, Reference Corpora, and Analysis Library;</w:t>
       </w:r>
     </w:p>
     <w:p>
@@ -2493,7 +2507,14 @@
           <w:b/>
           <w:sz w:val="22"/>
         </w:rPr>
-        <w:t>Other Text</w:t>
+        <w:t>Explore</w:t>
+      </w:r>
+      <w:r>
+        <w:rPr>
+          <w:rFonts w:ascii="Calibri" w:hAnsi="Calibri"/>
+          <w:sz w:val="22"/>
+        </w:rPr>
+        <w:t>: VerseMap, Lexicon Explorer, Form Library, and Corpus Browser;</w:t>
       </w:r>
     </w:p>
     <w:p>
@@ -2512,7 +2533,14 @@
           <w:b/>
           <w:sz w:val="22"/>
         </w:rPr>
-        <w:t>Lexicon Explorer</w:t>
+        <w:t>Learn</w:t>
+      </w:r>
+      <w:r>
+        <w:rPr>
+          <w:rFonts w:ascii="Calibri" w:hAnsi="Calibri"/>
+          <w:sz w:val="22"/>
+        </w:rPr>
+        <w:t>: Documentation and Methodology;</w:t>
       </w:r>
     </w:p>
     <w:p>
@@ -2657,6 +2685,137 @@
           <w:sz w:val="22"/>
         </w:rPr>
         <w:t>circular gear and question-mark controls for settings and help.</w:t>
+      </w:r>
+    </w:p>
+    <w:p>
+      <w:pPr>
+        <w:widowControl/>
+        <w:spacing w:before="0" w:after="120" w:line="300" w:lineRule="auto"/>
+      </w:pPr>
+      <w:r>
+        <w:rPr>
+          <w:rFonts w:ascii="Calibri" w:hAnsi="Calibri"/>
+          <w:sz w:val="22"/>
+        </w:rPr>
+        <w:t>Personal Corpus remains exclusive to the downloadable local edition. Routes whose later implementation is not yet complete are visibly marked as planned. The contextual sidebar keeps the current object, analysis profile, settings, comparison resources, research-notes location, analysis-management location, and export guidance together.</w:t>
+      </w:r>
+    </w:p>
+    <w:p>
+      <w:pPr>
+        <w:widowControl/>
+        <w:spacing w:before="0" w:after="120" w:line="300" w:lineRule="auto"/>
+      </w:pPr>
+      <w:r>
+        <w:rPr>
+          <w:rFonts w:ascii="Calibri" w:hAnsi="Calibri"/>
+          <w:sz w:val="22"/>
+        </w:rPr>
+        <w:t xml:space="preserve">Built-in analysis profiles are </w:t>
+      </w:r>
+      <w:r>
+        <w:rPr>
+          <w:rFonts w:ascii="Calibri" w:hAnsi="Calibri"/>
+          <w:b/>
+          <w:sz w:val="22"/>
+        </w:rPr>
+        <w:t>Full Poetic Analysis</w:t>
+      </w:r>
+      <w:r>
+        <w:rPr>
+          <w:rFonts w:ascii="Calibri" w:hAnsi="Calibri"/>
+          <w:sz w:val="22"/>
+        </w:rPr>
+        <w:t xml:space="preserve">, </w:t>
+      </w:r>
+      <w:r>
+        <w:rPr>
+          <w:rFonts w:ascii="Calibri" w:hAnsi="Calibri"/>
+          <w:b/>
+          <w:sz w:val="22"/>
+        </w:rPr>
+        <w:t>Computational Close Reading</w:t>
+      </w:r>
+      <w:r>
+        <w:rPr>
+          <w:rFonts w:ascii="Calibri" w:hAnsi="Calibri"/>
+          <w:sz w:val="22"/>
+        </w:rPr>
+        <w:t xml:space="preserve">, </w:t>
+      </w:r>
+      <w:r>
+        <w:rPr>
+          <w:rFonts w:ascii="Calibri" w:hAnsi="Calibri"/>
+          <w:b/>
+          <w:sz w:val="22"/>
+        </w:rPr>
+        <w:t>Affect and Emotion</w:t>
+      </w:r>
+      <w:r>
+        <w:rPr>
+          <w:rFonts w:ascii="Calibri" w:hAnsi="Calibri"/>
+          <w:sz w:val="22"/>
+        </w:rPr>
+        <w:t xml:space="preserve">, </w:t>
+      </w:r>
+      <w:r>
+        <w:rPr>
+          <w:rFonts w:ascii="Calibri" w:hAnsi="Calibri"/>
+          <w:b/>
+          <w:sz w:val="22"/>
+        </w:rPr>
+        <w:t>Sound and Prosody</w:t>
+      </w:r>
+      <w:r>
+        <w:rPr>
+          <w:rFonts w:ascii="Calibri" w:hAnsi="Calibri"/>
+          <w:sz w:val="22"/>
+        </w:rPr>
+        <w:t xml:space="preserve">, </w:t>
+      </w:r>
+      <w:r>
+        <w:rPr>
+          <w:rFonts w:ascii="Calibri" w:hAnsi="Calibri"/>
+          <w:b/>
+          <w:sz w:val="22"/>
+        </w:rPr>
+        <w:t>Formal Analysis</w:t>
+      </w:r>
+      <w:r>
+        <w:rPr>
+          <w:rFonts w:ascii="Calibri" w:hAnsi="Calibri"/>
+          <w:sz w:val="22"/>
+        </w:rPr>
+        <w:t xml:space="preserve">, and </w:t>
+      </w:r>
+      <w:r>
+        <w:rPr>
+          <w:rFonts w:ascii="Calibri" w:hAnsi="Calibri"/>
+          <w:b/>
+          <w:sz w:val="22"/>
+        </w:rPr>
+        <w:t>Teaching/Introductory</w:t>
+      </w:r>
+      <w:r>
+        <w:rPr>
+          <w:rFonts w:ascii="Calibri" w:hAnsi="Calibri"/>
+          <w:sz w:val="22"/>
+        </w:rPr>
+        <w:t xml:space="preserve">. Select </w:t>
+      </w:r>
+      <w:r>
+        <w:rPr>
+          <w:rFonts w:ascii="Calibri" w:hAnsi="Calibri"/>
+          <w:b/>
+          <w:sz w:val="22"/>
+        </w:rPr>
+        <w:t>Apply / Restore</w:t>
+      </w:r>
+      <w:r>
+        <w:rPr>
+          <w:rFonts w:ascii="Calibri" w:hAnsi="Calibri"/>
+          <w:sz w:val="22"/>
+        </w:rPr>
+        <w:t xml:space="preserve"> to establish a profile's defaults, then continue customizing if needed. Hosted custom profiles store configuration only for the current browser session; they never retain poem text, metadata, pronunciation overrides, results, or exports.</w:t>
       </w:r>
     </w:p>
     <w:p>
@@ -12985,7 +13144,7 @@
           <w:rFonts w:ascii="Calibri" w:hAnsi="Calibri"/>
           <w:sz w:val="22"/>
         </w:rPr>
-        <w:t>9. Project / Corpus Workspace</w:t>
+        <w:t>9. Saved Projects Workspace</w:t>
       </w:r>
     </w:p>
     <w:p>
@@ -13018,7 +13177,7 @@
           <w:b/>
           <w:sz w:val="22"/>
         </w:rPr>
-        <w:t>Project / Corpus</w:t>
+        <w:t>Collections → Saved Projects</w:t>
       </w:r>
       <w:r>
         <w:rPr>
@@ -13040,22 +13199,7 @@
           <w:rFonts w:ascii="Calibri" w:hAnsi="Calibri"/>
           <w:sz w:val="22"/>
         </w:rPr>
-        <w:t xml:space="preserve">, and enter a title. Description and researcher fields are optional. Projects persist locally in </w:t>
-      </w:r>
-      <w:r>
-        <w:rPr>
-          <w:rFonts w:ascii="Consolas" w:hAnsi="Consolas"/>
-          <w:color w:val="1F4D78"/>
-          <w:sz w:val="19"/>
-        </w:rPr>
-        <w:t>projects/versevad.sqlite3</w:t>
-      </w:r>
-      <w:r>
-        <w:rPr>
-          <w:rFonts w:ascii="Calibri" w:hAnsi="Calibri"/>
-          <w:sz w:val="22"/>
-        </w:rPr>
-        <w:t xml:space="preserve"> unless an alternate database path is configured.</w:t>
+        <w:t>, and enter a title. Description and researcher fields are optional. This is the workspace formerly labeled Project / Corpus. In the hosted edition its data are session-isolated and may be erased after disconnection or restart.</w:t>
       </w:r>
     </w:p>
     <w:p>

</xml_diff>

<commit_message>
Mirror analysis library and research notes
</commit_message>
<xml_diff>
--- a/docs/VerseVAD_User_Manual.docx
+++ b/docs/VerseVAD_User_Manual.docx
@@ -2697,7 +2697,7 @@
           <w:rFonts w:ascii="Calibri" w:hAnsi="Calibri"/>
           <w:sz w:val="22"/>
         </w:rPr>
-        <w:t>Personal Corpus remains exclusive to the downloadable local edition. Routes whose later implementation is not yet complete are visibly marked as planned. The contextual sidebar keeps the current object, analysis profile, settings, comparison resources, research-notes location, analysis-management location, and export guidance together.</w:t>
+        <w:t>Personal Corpus remains exclusive to the downloadable local edition. Routes whose later implementation is not yet complete are visibly marked as planned. The contextual sidebar keeps the current object, analysis profile, settings, comparison resources, working research-notes notebook, analysis-management controls, and export guidance together.</w:t>
       </w:r>
     </w:p>
     <w:p>
@@ -2828,6 +2828,19 @@
           <w:rFonts w:ascii="Calibri" w:hAnsi="Calibri"/>
           <w:sz w:val="22"/>
         </w:rPr>
+        <w:t>The top navigation is an opaque fixed bar. Its labels expand in size and spacing on wide windows and tighten on smaller panes. A hover-open menu closes after the pointer leaves both its section label and dropdown; click and keyboard navigation remain available.</w:t>
+      </w:r>
+    </w:p>
+    <w:p>
+      <w:pPr>
+        <w:widowControl/>
+        <w:spacing w:before="0" w:after="120" w:line="300" w:lineRule="auto"/>
+      </w:pPr>
+      <w:r>
+        <w:rPr>
+          <w:rFonts w:ascii="Calibri" w:hAnsi="Calibri"/>
+          <w:sz w:val="22"/>
+        </w:rPr>
         <w:t>The selected theme persists across closing and reopening VerseVAD. Legacy Light and System choices migrate safely to Classic. The selection is stored as an application-level local preference, not in a project or analysis configuration. Appearance does not change calculations, result IDs, project data, or exports. Publication-oriented charts remain light.</w:t>
       </w:r>
     </w:p>
@@ -2840,6 +2853,160 @@
           <w:rFonts w:ascii="Calibri" w:hAnsi="Calibri"/>
           <w:sz w:val="22"/>
         </w:rPr>
+        <w:t>Analysis Library, drafts, and research notes</w:t>
+      </w:r>
+    </w:p>
+    <w:p>
+      <w:pPr>
+        <w:widowControl/>
+        <w:spacing w:before="0" w:after="120" w:line="300" w:lineRule="auto"/>
+      </w:pPr>
+      <w:r>
+        <w:rPr>
+          <w:rFonts w:ascii="Calibri" w:hAnsi="Calibri"/>
+          <w:sz w:val="22"/>
+        </w:rPr>
+        <w:t xml:space="preserve">Entering text in Single Poem, Other Text, or Compare Poems creates a recoverable draft for the current hosted session. Open </w:t>
+      </w:r>
+      <w:r>
+        <w:rPr>
+          <w:rFonts w:ascii="Calibri" w:hAnsi="Calibri"/>
+          <w:b/>
+          <w:sz w:val="22"/>
+        </w:rPr>
+        <w:t>Collections → Analysis Library → Draft Analyses</w:t>
+      </w:r>
+      <w:r>
+        <w:rPr>
+          <w:rFonts w:ascii="Calibri" w:hAnsi="Calibri"/>
+          <w:sz w:val="22"/>
+        </w:rPr>
+        <w:t xml:space="preserve"> to recover it. Unchanged reruns do not add duplicate draft revisions.</w:t>
+      </w:r>
+    </w:p>
+    <w:p>
+      <w:pPr>
+        <w:widowControl/>
+        <w:spacing w:before="0" w:after="120" w:line="300" w:lineRule="auto"/>
+      </w:pPr>
+      <w:r>
+        <w:rPr>
+          <w:rFonts w:ascii="Calibri" w:hAnsi="Calibri"/>
+          <w:sz w:val="22"/>
+        </w:rPr>
+        <w:t xml:space="preserve">After analysis, </w:t>
+      </w:r>
+      <w:r>
+        <w:rPr>
+          <w:rFonts w:ascii="Calibri" w:hAnsi="Calibri"/>
+          <w:b/>
+          <w:sz w:val="22"/>
+        </w:rPr>
+        <w:t>Analysis Management</w:t>
+      </w:r>
+      <w:r>
+        <w:rPr>
+          <w:rFonts w:ascii="Calibri" w:hAnsi="Calibri"/>
+          <w:sz w:val="22"/>
+        </w:rPr>
+        <w:t xml:space="preserve"> can retain the full historical result and source text or a non-restorable results-only CSV/Word bundle. </w:t>
+      </w:r>
+      <w:r>
+        <w:rPr>
+          <w:rFonts w:ascii="Calibri" w:hAnsi="Calibri"/>
+          <w:b/>
+          <w:sz w:val="22"/>
+        </w:rPr>
+        <w:t>Save analysis</w:t>
+      </w:r>
+      <w:r>
+        <w:rPr>
+          <w:rFonts w:ascii="Calibri" w:hAnsi="Calibri"/>
+          <w:sz w:val="22"/>
+        </w:rPr>
+        <w:t xml:space="preserve"> appends an immutable revision; </w:t>
+      </w:r>
+      <w:r>
+        <w:rPr>
+          <w:rFonts w:ascii="Calibri" w:hAnsi="Calibri"/>
+          <w:b/>
+          <w:sz w:val="22"/>
+        </w:rPr>
+        <w:t>Save as new</w:t>
+      </w:r>
+      <w:r>
+        <w:rPr>
+          <w:rFonts w:ascii="Calibri" w:hAnsi="Calibri"/>
+          <w:sz w:val="22"/>
+        </w:rPr>
+        <w:t xml:space="preserve"> creates a separate item. Opening a full save identifies its VerseVAD version and never silently recalculates it.</w:t>
+      </w:r>
+    </w:p>
+    <w:p>
+      <w:pPr>
+        <w:widowControl/>
+        <w:spacing w:before="0" w:after="120" w:line="300" w:lineRule="auto"/>
+      </w:pPr>
+      <w:r>
+        <w:rPr>
+          <w:rFonts w:ascii="Calibri" w:hAnsi="Calibri"/>
+          <w:sz w:val="22"/>
+        </w:rPr>
+        <w:t xml:space="preserve">Research Notes attach to an analysis, draft, comparison, collection, lookup, section, metric, chart, passage, word, rhyme, or form candidate. Notes are excluded from exports by default. Explicit selection adds them to a Word appendix and, for full bundles, </w:t>
+      </w:r>
+      <w:r>
+        <w:rPr>
+          <w:rFonts w:ascii="Consolas" w:hAnsi="Consolas"/>
+          <w:color w:val="1F4D78"/>
+          <w:sz w:val="19"/>
+        </w:rPr>
+        <w:t>research_notes.csv</w:t>
+      </w:r>
+      <w:r>
+        <w:rPr>
+          <w:rFonts w:ascii="Calibri" w:hAnsi="Calibri"/>
+          <w:sz w:val="22"/>
+        </w:rPr>
+        <w:t xml:space="preserve"> and </w:t>
+      </w:r>
+      <w:r>
+        <w:rPr>
+          <w:rFonts w:ascii="Consolas" w:hAnsi="Consolas"/>
+          <w:color w:val="1F4D78"/>
+          <w:sz w:val="19"/>
+        </w:rPr>
+        <w:t>research_notes.md</w:t>
+      </w:r>
+      <w:r>
+        <w:rPr>
+          <w:rFonts w:ascii="Calibri" w:hAnsi="Calibri"/>
+          <w:sz w:val="22"/>
+        </w:rPr>
+        <w:t>.</w:t>
+      </w:r>
+    </w:p>
+    <w:p>
+      <w:pPr>
+        <w:widowControl/>
+        <w:spacing w:before="0" w:after="120" w:line="300" w:lineRule="auto"/>
+      </w:pPr>
+      <w:r>
+        <w:rPr>
+          <w:rFonts w:ascii="Calibri" w:hAnsi="Calibri"/>
+          <w:sz w:val="22"/>
+        </w:rPr>
+        <w:t>Hosted Analysis Library data are isolated but temporary. A timeout, restart, or redeployment can remove them, so download important work before the session ends. The Clear Text menu asks whether to keep the draft, save a completed analysis first, or discard only unsaved work.</w:t>
+      </w:r>
+    </w:p>
+    <w:p>
+      <w:pPr>
+        <w:pStyle w:val="Heading2"/>
+      </w:pPr>
+      <w:r>
+        <w:rPr>
+          <w:rFonts w:ascii="Calibri" w:hAnsi="Calibri"/>
+          <w:sz w:val="22"/>
+        </w:rPr>
         <w:t>Stop VerseVAD</w:t>
       </w:r>
     </w:p>
@@ -2853,7 +3020,7 @@
           <w:rFonts w:ascii="Calibri" w:hAnsi="Calibri"/>
           <w:sz w:val="22"/>
         </w:rPr>
-        <w:t>Close the browser tab, then close the visible launcher window. One-poem results exist only in the current application session unless downloaded. Corpus projects persist in the local SQLite database.</w:t>
+        <w:t>Close the browser tab, then close the visible launcher window. Hosted analyses, library items, and project data remain temporary unless downloaded.</w:t>
       </w:r>
     </w:p>
     <w:p>
@@ -3358,6 +3525,19 @@
           <w:sz w:val="22"/>
         </w:rPr>
         <w:t>, save the readable summary or full audit bundle.</w:t>
+      </w:r>
+    </w:p>
+    <w:p>
+      <w:pPr>
+        <w:widowControl/>
+        <w:spacing w:before="0" w:after="120" w:line="300" w:lineRule="auto"/>
+      </w:pPr>
+      <w:r>
+        <w:rPr>
+          <w:rFonts w:ascii="Calibri" w:hAnsi="Calibri"/>
+          <w:sz w:val="22"/>
+        </w:rPr>
+        <w:t xml:space="preserve">    Notes remain excluded unless explicitly selected.</w:t>
       </w:r>
     </w:p>
     <w:p>

</xml_diff>